<commit_message>
PowerBI Lab1 changes made
</commit_message>
<xml_diff>
--- a/PowerBILab1/Task1.docx
+++ b/PowerBILab1/Task1.docx
@@ -4,6 +4,9 @@
   <w:body>
     <w:p>
       <w:r>
+        <w:rPr>
+          <w:noProof/>
+        </w:rPr>
         <w:drawing>
           <wp:inline distT="0" distB="0" distL="0" distR="0" wp14:anchorId="3BC7007D" wp14:editId="0592FF00">
             <wp:extent cx="5943600" cy="3945890"/>
@@ -63,6 +66,9 @@
     </w:p>
     <w:p>
       <w:r>
+        <w:rPr>
+          <w:noProof/>
+        </w:rPr>
         <w:lastRenderedPageBreak/>
         <w:drawing>
           <wp:inline distT="0" distB="0" distL="0" distR="0" wp14:anchorId="3B894DC2" wp14:editId="33187EFA">
@@ -151,12 +157,46 @@
       <w:r>
         <w:t xml:space="preserve"> </w:t>
       </w:r>
-      <w:r>
+    </w:p>
+    <w:p>
+      <w:pPr>
+        <w:contextualSpacing/>
+      </w:pPr>
+      <w:r>
+        <w:t xml:space="preserve">In Power Query, the data type of </w:t>
+      </w:r>
+      <w:proofErr w:type="spellStart"/>
+      <w:r>
+        <w:t>DiscountPct</w:t>
+      </w:r>
+      <w:proofErr w:type="spellEnd"/>
+      <w:r>
+        <w:t xml:space="preserve"> was changed to Decimal Number. in Power BI Desktop, the Format was changed from a decimal representation to Percentage. The data type remained Decimal Number.</w:t>
+      </w:r>
+    </w:p>
+    <w:p>
+      <w:pPr>
+        <w:rPr>
+          <w:noProof/>
+        </w:rPr>
+      </w:pPr>
+    </w:p>
+    <w:p>
+      <w:pPr>
+        <w:rPr>
+          <w:noProof/>
+        </w:rPr>
+      </w:pPr>
+      <w:r>
+        <w:rPr>
+          <w:noProof/>
+        </w:rPr>
+        <w:lastRenderedPageBreak/>
         <w:drawing>
-          <wp:inline distT="0" distB="0" distL="0" distR="0" wp14:anchorId="523EDF87" wp14:editId="46AE2110">
-            <wp:extent cx="5943600" cy="3429635"/>
-            <wp:effectExtent l="0" t="0" r="0" b="0"/>
-            <wp:docPr id="2" name="Picture 2"/>
+          <wp:inline distT="0" distB="0" distL="0" distR="0" wp14:anchorId="645812B4" wp14:editId="358B3125">
+            <wp:extent cx="5943600" cy="3066415"/>
+            <wp:effectExtent l="0" t="0" r="0" b="635"/>
+            <wp:docPr id="27" name="Picture 27"/>
             <wp:cNvGraphicFramePr>
               <a:graphicFrameLocks xmlns:a="http://schemas.openxmlformats.org/drawingml/2006/main" noChangeAspect="1"/>
             </wp:cNvGraphicFramePr>
@@ -176,7 +216,7 @@
                   <pic:spPr>
                     <a:xfrm>
                       <a:off x="0" y="0"/>
-                      <a:ext cx="5943600" cy="3429635"/>
+                      <a:ext cx="5943600" cy="3066415"/>
                     </a:xfrm>
                     <a:prstGeom prst="rect">
                       <a:avLst/>
@@ -191,75 +231,19 @@
     </w:p>
     <w:p>
       <w:pPr>
-        <w:ind w:left="1440"/>
-        <w:contextualSpacing/>
-      </w:pPr>
-      <w:r>
-        <w:t xml:space="preserve">Subtract days </w:t>
-      </w:r>
-    </w:p>
-    <w:p>
-      <w:pPr>
-        <w:contextualSpacing/>
-        <w:rPr>
-          <w:rFonts w:ascii="Arial" w:hAnsi="Arial" w:cs="Arial"/>
-        </w:rPr>
-      </w:pPr>
-      <w:r>
-        <w:lastRenderedPageBreak/>
-        <w:t xml:space="preserve">#Option 1 - </w:t>
-      </w:r>
-      <w:r>
-        <w:rPr>
-          <w:rFonts w:ascii="Arial" w:hAnsi="Arial" w:cs="Arial"/>
-        </w:rPr>
-        <w:t>Select ‘StartDate’ and ‘</w:t>
-      </w:r>
-      <w:proofErr w:type="spellStart"/>
-      <w:r>
-        <w:rPr>
-          <w:rFonts w:ascii="Arial" w:hAnsi="Arial" w:cs="Arial"/>
-        </w:rPr>
-        <w:t>EndDate</w:t>
-      </w:r>
-      <w:proofErr w:type="spellEnd"/>
-      <w:r>
-        <w:rPr>
-          <w:rFonts w:ascii="Arial" w:hAnsi="Arial" w:cs="Arial"/>
-        </w:rPr>
-        <w:t>’ columns in ‘</w:t>
-      </w:r>
-      <w:proofErr w:type="spellStart"/>
-      <w:r>
-        <w:rPr>
-          <w:rFonts w:ascii="Arial" w:hAnsi="Arial" w:cs="Arial"/>
-        </w:rPr>
-        <w:t>DimPromotion</w:t>
-      </w:r>
-      <w:proofErr w:type="spellEnd"/>
-      <w:r>
-        <w:rPr>
-          <w:rFonts w:ascii="Arial" w:hAnsi="Arial" w:cs="Arial"/>
-        </w:rPr>
-        <w:t>’ table</w:t>
-      </w:r>
-      <w:r>
-        <w:rPr>
-          <w:rFonts w:ascii="Arial" w:hAnsi="Arial" w:cs="Arial"/>
-        </w:rPr>
-        <w:t xml:space="preserve"> and apply option for Date Subtraction.</w:t>
-      </w:r>
-    </w:p>
-    <w:p>
-      <w:r>
-        <w:br/>
-      </w:r>
-      <w:r>
+        <w:rPr>
+          <w:noProof/>
+        </w:rPr>
+      </w:pPr>
+      <w:r>
+        <w:rPr>
+          <w:noProof/>
+        </w:rPr>
         <w:drawing>
-          <wp:inline distT="0" distB="0" distL="0" distR="0" wp14:anchorId="1AB98D87" wp14:editId="6A46F63F">
-            <wp:extent cx="5943600" cy="3354705"/>
+          <wp:inline distT="0" distB="0" distL="0" distR="0" wp14:anchorId="7A7CD961" wp14:editId="78D9F987">
+            <wp:extent cx="5943600" cy="1962785"/>
             <wp:effectExtent l="0" t="0" r="0" b="0"/>
-            <wp:docPr id="3" name="Picture 3"/>
+            <wp:docPr id="28" name="Picture 28"/>
             <wp:cNvGraphicFramePr>
               <a:graphicFrameLocks xmlns:a="http://schemas.openxmlformats.org/drawingml/2006/main" noChangeAspect="1"/>
             </wp:cNvGraphicFramePr>
@@ -279,7 +263,7 @@
                   <pic:spPr>
                     <a:xfrm>
                       <a:off x="0" y="0"/>
-                      <a:ext cx="5943600" cy="3354705"/>
+                      <a:ext cx="5943600" cy="1962785"/>
                     </a:xfrm>
                     <a:prstGeom prst="rect">
                       <a:avLst/>
@@ -292,58 +276,78 @@
         </w:drawing>
       </w:r>
     </w:p>
-    <w:p>
-      <w:pPr>
-        <w:spacing w:line="240" w:lineRule="auto"/>
+    <w:p/>
+    <w:p>
+      <w:pPr>
+        <w:ind w:left="1440"/>
         <w:contextualSpacing/>
-        <w:rPr>
-          <w:rFonts w:ascii="Arial" w:hAnsi="Arial" w:cs="Arial"/>
-        </w:rPr>
-      </w:pPr>
-      <w:r>
-        <w:t xml:space="preserve">#Option2 - </w:t>
-      </w:r>
-      <w:r>
-        <w:rPr>
-          <w:rFonts w:ascii="Arial" w:hAnsi="Arial" w:cs="Arial"/>
-        </w:rPr>
-        <w:t>Create a Custom Column and type</w:t>
-      </w:r>
-      <w:r>
-        <w:rPr>
-          <w:rFonts w:ascii="Arial" w:hAnsi="Arial" w:cs="Arial"/>
-        </w:rPr>
-        <w:t xml:space="preserve"> the </w:t>
-      </w:r>
-      <w:r>
-        <w:rPr>
-          <w:rFonts w:ascii="Arial" w:hAnsi="Arial" w:cs="Arial"/>
-        </w:rPr>
-        <w:t xml:space="preserve">necessary Custom column </w:t>
-      </w:r>
-      <w:r>
-        <w:rPr>
-          <w:rFonts w:ascii="Arial" w:hAnsi="Arial" w:cs="Arial"/>
-        </w:rPr>
-        <w:t>formula</w:t>
-      </w:r>
-      <w:r>
-        <w:rPr>
-          <w:rFonts w:ascii="Arial" w:hAnsi="Arial" w:cs="Arial"/>
-        </w:rPr>
-        <w:t>.</w:t>
-      </w:r>
-    </w:p>
-    <w:p>
-      <w:r>
+      </w:pPr>
+    </w:p>
+    <w:p>
+      <w:pPr>
+        <w:contextualSpacing/>
+        <w:rPr>
+          <w:rFonts w:ascii="Arial" w:hAnsi="Arial" w:cs="Arial"/>
+        </w:rPr>
+      </w:pPr>
+      <w:r>
+        <w:t xml:space="preserve">#Option 1 - </w:t>
+      </w:r>
+      <w:r>
+        <w:rPr>
+          <w:rFonts w:ascii="Arial" w:hAnsi="Arial" w:cs="Arial"/>
+        </w:rPr>
+        <w:t>Select ‘StartDate’ and ‘</w:t>
+      </w:r>
+      <w:proofErr w:type="spellStart"/>
+      <w:r>
+        <w:rPr>
+          <w:rFonts w:ascii="Arial" w:hAnsi="Arial" w:cs="Arial"/>
+        </w:rPr>
+        <w:t>EndDate</w:t>
+      </w:r>
+      <w:proofErr w:type="spellEnd"/>
+      <w:r>
+        <w:rPr>
+          <w:rFonts w:ascii="Arial" w:hAnsi="Arial" w:cs="Arial"/>
+        </w:rPr>
+        <w:t>’ columns in ‘</w:t>
+      </w:r>
+      <w:proofErr w:type="spellStart"/>
+      <w:r>
+        <w:rPr>
+          <w:rFonts w:ascii="Arial" w:hAnsi="Arial" w:cs="Arial"/>
+        </w:rPr>
+        <w:t>DimPromotion</w:t>
+      </w:r>
+      <w:proofErr w:type="spellEnd"/>
+      <w:r>
+        <w:rPr>
+          <w:rFonts w:ascii="Arial" w:hAnsi="Arial" w:cs="Arial"/>
+        </w:rPr>
+        <w:t>’ table</w:t>
+      </w:r>
+      <w:r>
+        <w:rPr>
+          <w:rFonts w:ascii="Arial" w:hAnsi="Arial" w:cs="Arial"/>
+        </w:rPr>
+        <w:t xml:space="preserve"> and apply option for Date Subtraction.</w:t>
+      </w:r>
+    </w:p>
+    <w:p>
+      <w:r>
+        <w:lastRenderedPageBreak/>
         <w:br/>
       </w:r>
       <w:r>
+        <w:rPr>
+          <w:noProof/>
+        </w:rPr>
         <w:drawing>
-          <wp:inline distT="0" distB="0" distL="0" distR="0" wp14:anchorId="5DF3896B" wp14:editId="090D6872">
-            <wp:extent cx="5943600" cy="3213735"/>
-            <wp:effectExtent l="0" t="0" r="0" b="5715"/>
-            <wp:docPr id="4" name="Picture 4"/>
+          <wp:inline distT="0" distB="0" distL="0" distR="0" wp14:anchorId="1AB98D87" wp14:editId="6A46F63F">
+            <wp:extent cx="5943600" cy="3354705"/>
+            <wp:effectExtent l="0" t="0" r="0" b="0"/>
+            <wp:docPr id="3" name="Picture 3"/>
             <wp:cNvGraphicFramePr>
               <a:graphicFrameLocks xmlns:a="http://schemas.openxmlformats.org/drawingml/2006/main" noChangeAspect="1"/>
             </wp:cNvGraphicFramePr>
@@ -363,7 +367,7 @@
                   <pic:spPr>
                     <a:xfrm>
                       <a:off x="0" y="0"/>
-                      <a:ext cx="5943600" cy="3213735"/>
+                      <a:ext cx="5943600" cy="3354705"/>
                     </a:xfrm>
                     <a:prstGeom prst="rect">
                       <a:avLst/>
@@ -378,61 +382,59 @@
     </w:p>
     <w:p>
       <w:pPr>
-        <w:pStyle w:val="Heading2"/>
-        <w:ind w:left="720"/>
-      </w:pPr>
-      <w:r>
-        <w:lastRenderedPageBreak/>
-        <w:t>DATA PROFILING </w:t>
+        <w:spacing w:line="240" w:lineRule="auto"/>
+        <w:contextualSpacing/>
+        <w:rPr>
+          <w:rFonts w:ascii="Arial" w:hAnsi="Arial" w:cs="Arial"/>
+        </w:rPr>
+      </w:pPr>
+      <w:r>
+        <w:t xml:space="preserve">#Option2 - </w:t>
+      </w:r>
+      <w:r>
+        <w:rPr>
+          <w:rFonts w:ascii="Arial" w:hAnsi="Arial" w:cs="Arial"/>
+        </w:rPr>
+        <w:t>Create a Custom Column and type</w:t>
+      </w:r>
+      <w:r>
+        <w:rPr>
+          <w:rFonts w:ascii="Arial" w:hAnsi="Arial" w:cs="Arial"/>
+        </w:rPr>
+        <w:t xml:space="preserve"> the </w:t>
+      </w:r>
+      <w:r>
+        <w:rPr>
+          <w:rFonts w:ascii="Arial" w:hAnsi="Arial" w:cs="Arial"/>
+        </w:rPr>
+        <w:t xml:space="preserve">necessary Custom column </w:t>
+      </w:r>
+      <w:r>
+        <w:rPr>
+          <w:rFonts w:ascii="Arial" w:hAnsi="Arial" w:cs="Arial"/>
+        </w:rPr>
+        <w:t>formula</w:t>
+      </w:r>
+      <w:r>
+        <w:rPr>
+          <w:rFonts w:ascii="Arial" w:hAnsi="Arial" w:cs="Arial"/>
+        </w:rPr>
+        <w:t>.</w:t>
       </w:r>
     </w:p>
     <w:p>
       <w:r>
         <w:br/>
-        <w:t xml:space="preserve">Enabled </w:t>
-      </w:r>
-      <w:r>
-        <w:rPr>
-          <w:rStyle w:val="normaltextrun"/>
-          <w:rFonts w:ascii="Arial" w:hAnsi="Arial" w:cs="Arial"/>
-          <w:b/>
-          <w:bCs/>
-          <w:sz w:val="20"/>
-          <w:szCs w:val="20"/>
-        </w:rPr>
-        <w:t>Column Quality, Column distribution </w:t>
-      </w:r>
-      <w:r>
-        <w:rPr>
-          <w:rStyle w:val="normaltextrun"/>
-          <w:rFonts w:ascii="Arial" w:hAnsi="Arial" w:cs="Arial"/>
-          <w:sz w:val="20"/>
-          <w:szCs w:val="20"/>
-        </w:rPr>
-        <w:t>and</w:t>
-      </w:r>
-      <w:r>
-        <w:rPr>
-          <w:rStyle w:val="normaltextrun"/>
-          <w:rFonts w:ascii="Arial" w:hAnsi="Arial" w:cs="Arial"/>
-          <w:b/>
-          <w:bCs/>
-          <w:sz w:val="20"/>
-          <w:szCs w:val="20"/>
-        </w:rPr>
-        <w:t> Column profile</w:t>
-      </w:r>
-    </w:p>
-    <w:p>
-      <w:r>
-        <w:br/>
-      </w:r>
-      <w:r>
+      </w:r>
+      <w:r>
+        <w:rPr>
+          <w:noProof/>
+        </w:rPr>
         <w:drawing>
-          <wp:inline distT="0" distB="0" distL="0" distR="0" wp14:anchorId="30BE50AC" wp14:editId="3D592B36">
-            <wp:extent cx="5943600" cy="3581400"/>
-            <wp:effectExtent l="0" t="0" r="0" b="0"/>
-            <wp:docPr id="5" name="Picture 5"/>
+          <wp:inline distT="0" distB="0" distL="0" distR="0" wp14:anchorId="5DF3896B" wp14:editId="090D6872">
+            <wp:extent cx="5943600" cy="3213735"/>
+            <wp:effectExtent l="0" t="0" r="0" b="5715"/>
+            <wp:docPr id="4" name="Picture 4"/>
             <wp:cNvGraphicFramePr>
               <a:graphicFrameLocks xmlns:a="http://schemas.openxmlformats.org/drawingml/2006/main" noChangeAspect="1"/>
             </wp:cNvGraphicFramePr>
@@ -452,7 +454,7 @@
                   <pic:spPr>
                     <a:xfrm>
                       <a:off x="0" y="0"/>
-                      <a:ext cx="5943600" cy="3581400"/>
+                      <a:ext cx="5943600" cy="3213735"/>
                     </a:xfrm>
                     <a:prstGeom prst="rect">
                       <a:avLst/>
@@ -466,16 +468,30 @@
       </w:r>
     </w:p>
     <w:p>
+      <w:pPr>
+        <w:pStyle w:val="Heading2"/>
+        <w:ind w:left="720"/>
+      </w:pPr>
+      <w:r>
+        <w:t>DATA PROFILING </w:t>
+      </w:r>
+    </w:p>
+    <w:p>
+      <w:r>
+        <w:br/>
+        <w:t xml:space="preserve">Enabled </w:t>
+      </w:r>
       <w:r>
         <w:rPr>
           <w:rStyle w:val="normaltextrun"/>
           <w:rFonts w:ascii="Arial" w:hAnsi="Arial" w:cs="Arial"/>
+          <w:b/>
+          <w:bCs/>
           <w:sz w:val="20"/>
           <w:szCs w:val="20"/>
         </w:rPr>
-        <w:t>Create column ‘Order Year’ based on the ‘</w:t>
-      </w:r>
-      <w:proofErr w:type="spellStart"/>
+        <w:t>Column Quality, Column distribution </w:t>
+      </w:r>
       <w:r>
         <w:rPr>
           <w:rStyle w:val="normaltextrun"/>
@@ -483,47 +499,94 @@
           <w:sz w:val="20"/>
           <w:szCs w:val="20"/>
         </w:rPr>
-        <w:t>OrderDate</w:t>
-      </w:r>
-      <w:proofErr w:type="spellEnd"/>
+        <w:t>and</w:t>
+      </w:r>
       <w:r>
         <w:rPr>
           <w:rStyle w:val="normaltextrun"/>
           <w:rFonts w:ascii="Arial" w:hAnsi="Arial" w:cs="Arial"/>
+          <w:b/>
+          <w:bCs/>
           <w:sz w:val="20"/>
           <w:szCs w:val="20"/>
         </w:rPr>
-        <w:t>’ column in the table ‘</w:t>
-      </w:r>
-      <w:proofErr w:type="spellStart"/>
-      <w:r>
-        <w:rPr>
-          <w:rStyle w:val="normaltextrun"/>
-          <w:rFonts w:ascii="Arial" w:hAnsi="Arial" w:cs="Arial"/>
-          <w:sz w:val="20"/>
-          <w:szCs w:val="20"/>
-        </w:rPr>
+        <w:t> Column profile</w:t>
+      </w:r>
+    </w:p>
+    <w:p>
+      <w:r>
+        <w:lastRenderedPageBreak/>
+        <w:t xml:space="preserve">Data profiling was performed in Power Query before further transformations in order to evaluate the quality and structure of the imported </w:t>
+      </w:r>
+      <w:proofErr w:type="spellStart"/>
+      <w:r>
+        <w:t>AdventureWorks</w:t>
+      </w:r>
+      <w:proofErr w:type="spellEnd"/>
+      <w:r>
+        <w:t xml:space="preserve"> data. The Column Quality, Column Distribution, and Column Profile options were enabled. These profiling tools were used to inspect valid, error, and empty values, as well as the distribution and uniqueness of values in the selected columns. This step helps identify potential data-quality issues before grouping, joining, and aggregating the data.</w:t>
+      </w:r>
+    </w:p>
+    <w:p>
+      <w:r>
+        <w:t>The profiling results for the displayed columns showed that the data was valid, with no visible errors or empty values in the inspected fields. Column Distribution demonstrated the number and frequency of distinct values, which made it possible to verify whether categorical and key fields contained reasonable value sets. No critical data-quality problems requiring additional cleansing were identified in the inspected columns.</w:t>
+      </w:r>
+    </w:p>
+    <w:p>
+      <w:r>
+        <w:t xml:space="preserve">During profiling, an additional column Order Year was created in </w:t>
+      </w:r>
+      <w:proofErr w:type="spellStart"/>
+      <w:r>
         <w:t>FactInternetSales</w:t>
       </w:r>
       <w:proofErr w:type="spellEnd"/>
       <w:r>
-        <w:rPr>
-          <w:rStyle w:val="normaltextrun"/>
-          <w:rFonts w:ascii="Arial" w:hAnsi="Arial" w:cs="Arial"/>
-          <w:sz w:val="20"/>
-          <w:szCs w:val="20"/>
-        </w:rPr>
-        <w:t>’</w:t>
-      </w:r>
-    </w:p>
-    <w:p>
-      <w:r>
-        <w:lastRenderedPageBreak/>
+        <w:t xml:space="preserve"> from the </w:t>
+      </w:r>
+      <w:proofErr w:type="spellStart"/>
+      <w:r>
+        <w:t>OrderDate</w:t>
+      </w:r>
+      <w:proofErr w:type="spellEnd"/>
+      <w:r>
+        <w:t xml:space="preserve"> column using </w:t>
+      </w:r>
+      <w:proofErr w:type="spellStart"/>
+      <w:r>
+        <w:t>Date.Year</w:t>
+      </w:r>
+      <w:proofErr w:type="spellEnd"/>
+      <w:r>
+        <w:t>([</w:t>
+      </w:r>
+      <w:proofErr w:type="spellStart"/>
+      <w:r>
+        <w:t>OrderDate</w:t>
+      </w:r>
+      <w:proofErr w:type="spellEnd"/>
+      <w:r>
+        <w:t>]). This transformed the full transaction date into a year-level attribute that could subsequently be used for pivoting, grouping, and year-based sales analysis.</w:t>
+      </w:r>
+    </w:p>
+    <w:p>
+      <w:r>
+        <w:t>Conclusion. The profiling stage confirmed that the inspected source data was suitable for the subsequent transformations and analytical operations. No significant missing-value or error-related issues were detected in the profiled fields. Creating the Order Year attribute also prepared the dataset for later aggregation and comparison of sales results by year.</w:t>
+      </w:r>
+    </w:p>
+    <w:p>
+      <w:r>
+        <w:br/>
+      </w:r>
+      <w:r>
+        <w:rPr>
+          <w:noProof/>
+        </w:rPr>
         <w:drawing>
-          <wp:inline distT="0" distB="0" distL="0" distR="0" wp14:anchorId="17350D02" wp14:editId="2534C2A7">
-            <wp:extent cx="5943600" cy="3715385"/>
+          <wp:inline distT="0" distB="0" distL="0" distR="0" wp14:anchorId="30BE50AC" wp14:editId="3D592B36">
+            <wp:extent cx="5943600" cy="3581400"/>
             <wp:effectExtent l="0" t="0" r="0" b="0"/>
-            <wp:docPr id="6" name="Picture 6"/>
+            <wp:docPr id="5" name="Picture 5"/>
             <wp:cNvGraphicFramePr>
               <a:graphicFrameLocks xmlns:a="http://schemas.openxmlformats.org/drawingml/2006/main" noChangeAspect="1"/>
             </wp:cNvGraphicFramePr>
@@ -543,7 +606,7 @@
                   <pic:spPr>
                     <a:xfrm>
                       <a:off x="0" y="0"/>
-                      <a:ext cx="5943600" cy="3715385"/>
+                      <a:ext cx="5943600" cy="3581400"/>
                     </a:xfrm>
                     <a:prstGeom prst="rect">
                       <a:avLst/>
@@ -558,11 +621,66 @@
     </w:p>
     <w:p>
       <w:r>
+        <w:rPr>
+          <w:rStyle w:val="normaltextrun"/>
+          <w:rFonts w:ascii="Arial" w:hAnsi="Arial" w:cs="Arial"/>
+          <w:sz w:val="20"/>
+          <w:szCs w:val="20"/>
+        </w:rPr>
+        <w:t>Create column ‘Order Year’ based on the ‘</w:t>
+      </w:r>
+      <w:proofErr w:type="spellStart"/>
+      <w:r>
+        <w:rPr>
+          <w:rStyle w:val="normaltextrun"/>
+          <w:rFonts w:ascii="Arial" w:hAnsi="Arial" w:cs="Arial"/>
+          <w:sz w:val="20"/>
+          <w:szCs w:val="20"/>
+        </w:rPr>
+        <w:t>OrderDate</w:t>
+      </w:r>
+      <w:proofErr w:type="spellEnd"/>
+      <w:r>
+        <w:rPr>
+          <w:rStyle w:val="normaltextrun"/>
+          <w:rFonts w:ascii="Arial" w:hAnsi="Arial" w:cs="Arial"/>
+          <w:sz w:val="20"/>
+          <w:szCs w:val="20"/>
+        </w:rPr>
+        <w:t>’ column in the table ‘</w:t>
+      </w:r>
+      <w:proofErr w:type="spellStart"/>
+      <w:r>
+        <w:rPr>
+          <w:rStyle w:val="normaltextrun"/>
+          <w:rFonts w:ascii="Arial" w:hAnsi="Arial" w:cs="Arial"/>
+          <w:sz w:val="20"/>
+          <w:szCs w:val="20"/>
+        </w:rPr>
+        <w:t>FactInternetSales</w:t>
+      </w:r>
+      <w:proofErr w:type="spellEnd"/>
+      <w:r>
+        <w:rPr>
+          <w:rStyle w:val="normaltextrun"/>
+          <w:rFonts w:ascii="Arial" w:hAnsi="Arial" w:cs="Arial"/>
+          <w:sz w:val="20"/>
+          <w:szCs w:val="20"/>
+        </w:rPr>
+        <w:t>’</w:t>
+      </w:r>
+    </w:p>
+    <w:p>
+      <w:r>
+        <w:rPr>
+          <w:noProof/>
+        </w:rPr>
+        <w:lastRenderedPageBreak/>
         <w:drawing>
-          <wp:inline distT="0" distB="0" distL="0" distR="0" wp14:anchorId="4AD3B31C" wp14:editId="7F9EBD29">
-            <wp:extent cx="5943600" cy="3634105"/>
-            <wp:effectExtent l="0" t="0" r="0" b="4445"/>
-            <wp:docPr id="7" name="Picture 7"/>
+          <wp:inline distT="0" distB="0" distL="0" distR="0" wp14:anchorId="17350D02" wp14:editId="2534C2A7">
+            <wp:extent cx="5943600" cy="3715385"/>
+            <wp:effectExtent l="0" t="0" r="0" b="0"/>
+            <wp:docPr id="6" name="Picture 6"/>
             <wp:cNvGraphicFramePr>
               <a:graphicFrameLocks xmlns:a="http://schemas.openxmlformats.org/drawingml/2006/main" noChangeAspect="1"/>
             </wp:cNvGraphicFramePr>
@@ -582,7 +700,7 @@
                   <pic:spPr>
                     <a:xfrm>
                       <a:off x="0" y="0"/>
-                      <a:ext cx="5943600" cy="3634105"/>
+                      <a:ext cx="5943600" cy="3715385"/>
                     </a:xfrm>
                     <a:prstGeom prst="rect">
                       <a:avLst/>
@@ -598,42 +716,13 @@
     <w:p>
       <w:r>
         <w:rPr>
-          <w:rStyle w:val="normaltextrun"/>
-          <w:rFonts w:ascii="Arial" w:hAnsi="Arial" w:cs="Arial"/>
-          <w:sz w:val="20"/>
-          <w:szCs w:val="20"/>
-        </w:rPr>
-        <w:t>new table based on ‘</w:t>
-      </w:r>
-      <w:proofErr w:type="spellStart"/>
-      <w:r>
-        <w:rPr>
-          <w:rStyle w:val="normaltextrun"/>
-          <w:rFonts w:ascii="Arial" w:hAnsi="Arial" w:cs="Arial"/>
-          <w:sz w:val="20"/>
-          <w:szCs w:val="20"/>
-        </w:rPr>
-        <w:t>FactInternetSales</w:t>
-      </w:r>
-      <w:proofErr w:type="spellEnd"/>
-      <w:r>
-        <w:rPr>
-          <w:rStyle w:val="normaltextrun"/>
-          <w:rFonts w:ascii="Arial" w:hAnsi="Arial" w:cs="Arial"/>
-          <w:sz w:val="20"/>
-          <w:szCs w:val="20"/>
-        </w:rPr>
-        <w:t>’</w:t>
-      </w:r>
-    </w:p>
-    <w:p>
-      <w:r>
-        <w:lastRenderedPageBreak/>
+          <w:noProof/>
+        </w:rPr>
         <w:drawing>
-          <wp:inline distT="0" distB="0" distL="0" distR="0" wp14:anchorId="555DA100" wp14:editId="17681E8A">
-            <wp:extent cx="5943600" cy="3533140"/>
-            <wp:effectExtent l="0" t="0" r="0" b="0"/>
-            <wp:docPr id="8" name="Picture 8"/>
+          <wp:inline distT="0" distB="0" distL="0" distR="0" wp14:anchorId="4AD3B31C" wp14:editId="7F9EBD29">
+            <wp:extent cx="5943600" cy="3634105"/>
+            <wp:effectExtent l="0" t="0" r="0" b="4445"/>
+            <wp:docPr id="7" name="Picture 7"/>
             <wp:cNvGraphicFramePr>
               <a:graphicFrameLocks xmlns:a="http://schemas.openxmlformats.org/drawingml/2006/main" noChangeAspect="1"/>
             </wp:cNvGraphicFramePr>
@@ -653,7 +742,7 @@
                   <pic:spPr>
                     <a:xfrm>
                       <a:off x="0" y="0"/>
-                      <a:ext cx="5943600" cy="3533140"/>
+                      <a:ext cx="5943600" cy="3634105"/>
                     </a:xfrm>
                     <a:prstGeom prst="rect">
                       <a:avLst/>
@@ -667,20 +756,6 @@
       </w:r>
     </w:p>
     <w:p>
-      <w:pPr>
-        <w:pStyle w:val="paragraph"/>
-        <w:numPr>
-          <w:ilvl w:val="0"/>
-          <w:numId w:val="2"/>
-        </w:numPr>
-        <w:spacing w:before="0" w:beforeAutospacing="0" w:after="0" w:afterAutospacing="0"/>
-        <w:textAlignment w:val="baseline"/>
-        <w:rPr>
-          <w:rFonts w:ascii="Segoe UI" w:hAnsi="Segoe UI" w:cs="Segoe UI"/>
-          <w:sz w:val="18"/>
-          <w:szCs w:val="18"/>
-        </w:rPr>
-      </w:pPr>
       <w:r>
         <w:rPr>
           <w:rStyle w:val="normaltextrun"/>
@@ -688,7 +763,7 @@
           <w:sz w:val="20"/>
           <w:szCs w:val="20"/>
         </w:rPr>
-        <w:t>Choose column ‘Order Year’ (‘</w:t>
+        <w:t>new table based on ‘</w:t>
       </w:r>
       <w:proofErr w:type="spellStart"/>
       <w:r>
@@ -698,7 +773,7 @@
           <w:sz w:val="20"/>
           <w:szCs w:val="20"/>
         </w:rPr>
-        <w:t>SalesByYearsNPrice</w:t>
+        <w:t>FactInternetSales</w:t>
       </w:r>
       <w:proofErr w:type="spellEnd"/>
       <w:r>
@@ -708,55 +783,20 @@
           <w:sz w:val="20"/>
           <w:szCs w:val="20"/>
         </w:rPr>
-        <w:t>’ table), navigate on the </w:t>
-      </w:r>
-      <w:r>
-        <w:rPr>
-          <w:rStyle w:val="normaltextrun"/>
-          <w:rFonts w:ascii="Arial" w:hAnsi="Arial" w:cs="Arial"/>
-          <w:b/>
-          <w:bCs/>
-          <w:sz w:val="20"/>
-          <w:szCs w:val="20"/>
-        </w:rPr>
-        <w:t>Transform </w:t>
-      </w:r>
-      <w:r>
-        <w:rPr>
-          <w:rStyle w:val="normaltextrun"/>
-          <w:rFonts w:ascii="Arial" w:hAnsi="Arial" w:cs="Arial"/>
-          <w:sz w:val="20"/>
-          <w:szCs w:val="20"/>
-        </w:rPr>
-        <w:t>tab and click on </w:t>
-      </w:r>
-      <w:r>
-        <w:rPr>
-          <w:rStyle w:val="normaltextrun"/>
-          <w:rFonts w:ascii="Arial" w:hAnsi="Arial" w:cs="Arial"/>
-          <w:b/>
-          <w:bCs/>
-          <w:sz w:val="20"/>
-          <w:szCs w:val="20"/>
-        </w:rPr>
-        <w:t>Pivot Column</w:t>
-      </w:r>
-      <w:r>
-        <w:rPr>
-          <w:rStyle w:val="eop"/>
-          <w:rFonts w:ascii="Arial" w:hAnsi="Arial" w:cs="Arial"/>
-        </w:rPr>
-        <w:t> </w:t>
-      </w:r>
-    </w:p>
-    <w:p/>
-    <w:p>
-      <w:r>
+        <w:t>’</w:t>
+      </w:r>
+    </w:p>
+    <w:p>
+      <w:r>
+        <w:rPr>
+          <w:noProof/>
+        </w:rPr>
+        <w:lastRenderedPageBreak/>
         <w:drawing>
-          <wp:inline distT="0" distB="0" distL="0" distR="0" wp14:anchorId="6E72F96B" wp14:editId="1E019F96">
-            <wp:extent cx="5943600" cy="2352675"/>
-            <wp:effectExtent l="0" t="0" r="0" b="9525"/>
-            <wp:docPr id="9" name="Picture 9"/>
+          <wp:inline distT="0" distB="0" distL="0" distR="0" wp14:anchorId="555DA100" wp14:editId="17681E8A">
+            <wp:extent cx="5943600" cy="3533140"/>
+            <wp:effectExtent l="0" t="0" r="0" b="0"/>
+            <wp:docPr id="8" name="Picture 8"/>
             <wp:cNvGraphicFramePr>
               <a:graphicFrameLocks xmlns:a="http://schemas.openxmlformats.org/drawingml/2006/main" noChangeAspect="1"/>
             </wp:cNvGraphicFramePr>
@@ -776,7 +816,7 @@
                   <pic:spPr>
                     <a:xfrm>
                       <a:off x="0" y="0"/>
-                      <a:ext cx="5943600" cy="2352675"/>
+                      <a:ext cx="5943600" cy="3533140"/>
                     </a:xfrm>
                     <a:prstGeom prst="rect">
                       <a:avLst/>
@@ -790,6 +830,20 @@
       </w:r>
     </w:p>
     <w:p>
+      <w:pPr>
+        <w:pStyle w:val="paragraph"/>
+        <w:numPr>
+          <w:ilvl w:val="0"/>
+          <w:numId w:val="2"/>
+        </w:numPr>
+        <w:spacing w:before="0" w:beforeAutospacing="0" w:after="0" w:afterAutospacing="0"/>
+        <w:textAlignment w:val="baseline"/>
+        <w:rPr>
+          <w:rFonts w:ascii="Segoe UI" w:hAnsi="Segoe UI" w:cs="Segoe UI"/>
+          <w:sz w:val="18"/>
+          <w:szCs w:val="18"/>
+        </w:rPr>
+      </w:pPr>
       <w:r>
         <w:rPr>
           <w:rStyle w:val="normaltextrun"/>
@@ -797,7 +851,7 @@
           <w:sz w:val="20"/>
           <w:szCs w:val="20"/>
         </w:rPr>
-        <w:t>Join ‘</w:t>
+        <w:t>Choose column ‘Order Year’ (‘</w:t>
       </w:r>
       <w:proofErr w:type="spellStart"/>
       <w:r>
@@ -807,7 +861,7 @@
           <w:sz w:val="20"/>
           <w:szCs w:val="20"/>
         </w:rPr>
-        <w:t>SalesByCountry</w:t>
+        <w:t>SalesByYearsNPrice</w:t>
       </w:r>
       <w:proofErr w:type="spellEnd"/>
       <w:r>
@@ -817,19 +871,19 @@
           <w:sz w:val="20"/>
           <w:szCs w:val="20"/>
         </w:rPr>
-        <w:t>’ and ‘</w:t>
-      </w:r>
-      <w:proofErr w:type="spellStart"/>
+        <w:t>’ table), navigate on the </w:t>
+      </w:r>
       <w:r>
         <w:rPr>
           <w:rStyle w:val="normaltextrun"/>
           <w:rFonts w:ascii="Arial" w:hAnsi="Arial" w:cs="Arial"/>
+          <w:b/>
+          <w:bCs/>
           <w:sz w:val="20"/>
           <w:szCs w:val="20"/>
         </w:rPr>
-        <w:t>DimSalesTerritory</w:t>
-      </w:r>
-      <w:proofErr w:type="spellEnd"/>
+        <w:t>Transform </w:t>
+      </w:r>
       <w:r>
         <w:rPr>
           <w:rStyle w:val="normaltextrun"/>
@@ -837,37 +891,38 @@
           <w:sz w:val="20"/>
           <w:szCs w:val="20"/>
         </w:rPr>
-        <w:t>’ tables</w:t>
+        <w:t>tab and click on </w:t>
       </w:r>
       <w:r>
         <w:rPr>
           <w:rStyle w:val="normaltextrun"/>
           <w:rFonts w:ascii="Arial" w:hAnsi="Arial" w:cs="Arial"/>
+          <w:b/>
+          <w:bCs/>
           <w:sz w:val="20"/>
           <w:szCs w:val="20"/>
         </w:rPr>
-        <w:t xml:space="preserve"> by </w:t>
-      </w:r>
-      <w:proofErr w:type="spellStart"/>
-      <w:r>
-        <w:rPr>
-          <w:rStyle w:val="normaltextrun"/>
-          <w:rFonts w:ascii="Arial" w:hAnsi="Arial" w:cs="Arial"/>
-          <w:sz w:val="20"/>
-          <w:szCs w:val="20"/>
-        </w:rPr>
-        <w:t>SalesTerritoryKey</w:t>
-      </w:r>
-      <w:proofErr w:type="spellEnd"/>
-    </w:p>
-    <w:p>
-      <w:r>
-        <w:lastRenderedPageBreak/>
+        <w:t>Pivot Column</w:t>
+      </w:r>
+      <w:r>
+        <w:rPr>
+          <w:rStyle w:val="eop"/>
+          <w:rFonts w:ascii="Arial" w:hAnsi="Arial" w:cs="Arial"/>
+        </w:rPr>
+        <w:t> </w:t>
+      </w:r>
+    </w:p>
+    <w:p/>
+    <w:p>
+      <w:r>
+        <w:rPr>
+          <w:noProof/>
+        </w:rPr>
         <w:drawing>
-          <wp:inline distT="0" distB="0" distL="0" distR="0" wp14:anchorId="524A359D" wp14:editId="10BCC154">
-            <wp:extent cx="5943600" cy="4016375"/>
-            <wp:effectExtent l="0" t="0" r="0" b="3175"/>
-            <wp:docPr id="10" name="Picture 10"/>
+          <wp:inline distT="0" distB="0" distL="0" distR="0" wp14:anchorId="6E72F96B" wp14:editId="1E019F96">
+            <wp:extent cx="5943600" cy="2352675"/>
+            <wp:effectExtent l="0" t="0" r="0" b="9525"/>
+            <wp:docPr id="9" name="Picture 9"/>
             <wp:cNvGraphicFramePr>
               <a:graphicFrameLocks xmlns:a="http://schemas.openxmlformats.org/drawingml/2006/main" noChangeAspect="1"/>
             </wp:cNvGraphicFramePr>
@@ -887,7 +942,7 @@
                   <pic:spPr>
                     <a:xfrm>
                       <a:off x="0" y="0"/>
-                      <a:ext cx="5943600" cy="4016375"/>
+                      <a:ext cx="5943600" cy="2352675"/>
                     </a:xfrm>
                     <a:prstGeom prst="rect">
                       <a:avLst/>
@@ -901,21 +956,16 @@
       </w:r>
     </w:p>
     <w:p>
-      <w:pPr>
-        <w:pStyle w:val="paragraph"/>
-        <w:numPr>
-          <w:ilvl w:val="0"/>
-          <w:numId w:val="3"/>
-        </w:numPr>
-        <w:spacing w:before="0" w:beforeAutospacing="0" w:after="0" w:afterAutospacing="0"/>
-        <w:ind w:left="1080" w:firstLine="0"/>
-        <w:textAlignment w:val="baseline"/>
-        <w:rPr>
+      <w:r>
+        <w:rPr>
+          <w:rStyle w:val="normaltextrun"/>
           <w:rFonts w:ascii="Arial" w:hAnsi="Arial" w:cs="Arial"/>
           <w:sz w:val="20"/>
           <w:szCs w:val="20"/>
         </w:rPr>
-      </w:pPr>
+        <w:t>Join ‘</w:t>
+      </w:r>
+      <w:proofErr w:type="spellStart"/>
       <w:r>
         <w:rPr>
           <w:rStyle w:val="normaltextrun"/>
@@ -923,9 +973,9 @@
           <w:sz w:val="20"/>
           <w:szCs w:val="20"/>
         </w:rPr>
-        <w:t>show the ‘Sales </w:t>
-      </w:r>
-      <w:proofErr w:type="spellStart"/>
+        <w:t>SalesByCountry</w:t>
+      </w:r>
+      <w:proofErr w:type="spellEnd"/>
       <w:r>
         <w:rPr>
           <w:rStyle w:val="normaltextrun"/>
@@ -933,9 +983,9 @@
           <w:sz w:val="20"/>
           <w:szCs w:val="20"/>
         </w:rPr>
-        <w:t>territoryCountry</w:t>
-      </w:r>
-      <w:proofErr w:type="spellEnd"/>
+        <w:t>’ and ‘</w:t>
+      </w:r>
+      <w:proofErr w:type="spellStart"/>
       <w:r>
         <w:rPr>
           <w:rStyle w:val="normaltextrun"/>
@@ -943,32 +993,50 @@
           <w:sz w:val="20"/>
           <w:szCs w:val="20"/>
         </w:rPr>
-        <w:t>’ column in the new table.</w:t>
-      </w:r>
-      <w:r>
-        <w:rPr>
-          <w:rStyle w:val="eop"/>
-          <w:rFonts w:ascii="Arial" w:hAnsi="Arial" w:cs="Arial"/>
-        </w:rPr>
-        <w:t> </w:t>
-      </w:r>
-      <w:r>
-        <w:rPr>
-          <w:rStyle w:val="eop"/>
-          <w:rFonts w:ascii="Arial" w:hAnsi="Arial" w:cs="Arial"/>
-        </w:rPr>
-        <w:t> </w:t>
-      </w:r>
-    </w:p>
-    <w:p/>
-    <w:p>
-      <w:r>
+        <w:t>DimSalesTerritory</w:t>
+      </w:r>
+      <w:proofErr w:type="spellEnd"/>
+      <w:r>
+        <w:rPr>
+          <w:rStyle w:val="normaltextrun"/>
+          <w:rFonts w:ascii="Arial" w:hAnsi="Arial" w:cs="Arial"/>
+          <w:sz w:val="20"/>
+          <w:szCs w:val="20"/>
+        </w:rPr>
+        <w:t>’ tables</w:t>
+      </w:r>
+      <w:r>
+        <w:rPr>
+          <w:rStyle w:val="normaltextrun"/>
+          <w:rFonts w:ascii="Arial" w:hAnsi="Arial" w:cs="Arial"/>
+          <w:sz w:val="20"/>
+          <w:szCs w:val="20"/>
+        </w:rPr>
+        <w:t xml:space="preserve"> by </w:t>
+      </w:r>
+      <w:proofErr w:type="spellStart"/>
+      <w:r>
+        <w:rPr>
+          <w:rStyle w:val="normaltextrun"/>
+          <w:rFonts w:ascii="Arial" w:hAnsi="Arial" w:cs="Arial"/>
+          <w:sz w:val="20"/>
+          <w:szCs w:val="20"/>
+        </w:rPr>
+        <w:t>SalesTerritoryKey</w:t>
+      </w:r>
+      <w:proofErr w:type="spellEnd"/>
+    </w:p>
+    <w:p>
+      <w:r>
+        <w:rPr>
+          <w:noProof/>
+        </w:rPr>
         <w:lastRenderedPageBreak/>
         <w:drawing>
-          <wp:inline distT="0" distB="0" distL="0" distR="0" wp14:anchorId="65344841" wp14:editId="7454B067">
-            <wp:extent cx="5943600" cy="4675505"/>
-            <wp:effectExtent l="0" t="0" r="0" b="0"/>
-            <wp:docPr id="11" name="Picture 11"/>
+          <wp:inline distT="0" distB="0" distL="0" distR="0" wp14:anchorId="524A359D" wp14:editId="10BCC154">
+            <wp:extent cx="5943600" cy="4016375"/>
+            <wp:effectExtent l="0" t="0" r="0" b="3175"/>
+            <wp:docPr id="10" name="Picture 10"/>
             <wp:cNvGraphicFramePr>
               <a:graphicFrameLocks xmlns:a="http://schemas.openxmlformats.org/drawingml/2006/main" noChangeAspect="1"/>
             </wp:cNvGraphicFramePr>
@@ -988,7 +1056,7 @@
                   <pic:spPr>
                     <a:xfrm>
                       <a:off x="0" y="0"/>
-                      <a:ext cx="5943600" cy="4675505"/>
+                      <a:ext cx="5943600" cy="4016375"/>
                     </a:xfrm>
                     <a:prstGeom prst="rect">
                       <a:avLst/>
@@ -1006,13 +1074,12 @@
         <w:pStyle w:val="paragraph"/>
         <w:numPr>
           <w:ilvl w:val="0"/>
-          <w:numId w:val="4"/>
+          <w:numId w:val="3"/>
         </w:numPr>
         <w:spacing w:before="0" w:beforeAutospacing="0" w:after="0" w:afterAutospacing="0"/>
         <w:ind w:left="1080" w:firstLine="0"/>
         <w:textAlignment w:val="baseline"/>
         <w:rPr>
-          <w:rStyle w:val="eop"/>
           <w:rFonts w:ascii="Arial" w:hAnsi="Arial" w:cs="Arial"/>
           <w:sz w:val="20"/>
           <w:szCs w:val="20"/>
@@ -1025,7 +1092,7 @@
           <w:sz w:val="20"/>
           <w:szCs w:val="20"/>
         </w:rPr>
-        <w:t>Join </w:t>
+        <w:t>show the ‘Sales </w:t>
       </w:r>
       <w:proofErr w:type="spellStart"/>
       <w:r>
@@ -1035,7 +1102,7 @@
           <w:sz w:val="20"/>
           <w:szCs w:val="20"/>
         </w:rPr>
-        <w:t>DimProductCategory</w:t>
+        <w:t>territoryCountry</w:t>
       </w:r>
       <w:proofErr w:type="spellEnd"/>
       <w:r>
@@ -1045,38 +1112,7 @@
           <w:sz w:val="20"/>
           <w:szCs w:val="20"/>
         </w:rPr>
-        <w:t>[</w:t>
-      </w:r>
-      <w:proofErr w:type="spellStart"/>
-      <w:r>
-        <w:rPr>
-          <w:rStyle w:val="normaltextrun"/>
-          <w:rFonts w:ascii="Arial" w:hAnsi="Arial" w:cs="Arial"/>
-          <w:sz w:val="20"/>
-          <w:szCs w:val="20"/>
-        </w:rPr>
-        <w:t>EnglishProductCategory</w:t>
-      </w:r>
-      <w:proofErr w:type="spellEnd"/>
-      <w:r>
-        <w:rPr>
-          <w:rStyle w:val="normaltextrun"/>
-          <w:rFonts w:ascii="Arial" w:hAnsi="Arial" w:cs="Arial"/>
-          <w:sz w:val="20"/>
-          <w:szCs w:val="20"/>
-        </w:rPr>
-        <w:t>] column in the same way. </w:t>
-      </w:r>
-      <w:r>
-        <w:rPr>
-          <w:rStyle w:val="normaltextrun"/>
-          <w:rFonts w:ascii="Arial" w:hAnsi="Arial" w:cs="Arial"/>
-          <w:b/>
-          <w:bCs/>
-          <w:sz w:val="20"/>
-          <w:szCs w:val="20"/>
-        </w:rPr>
-        <w:t>(Hint: To complete this task you need to join 3 tables).</w:t>
+        <w:t>’ column in the new table.</w:t>
       </w:r>
       <w:r>
         <w:rPr>
@@ -1085,72 +1121,26 @@
         </w:rPr>
         <w:t> </w:t>
       </w:r>
-    </w:p>
-    <w:p>
-      <w:pPr>
-        <w:pStyle w:val="Heading2"/>
-        <w:ind w:left="720"/>
-      </w:pPr>
-      <w:r>
-        <w:t>GROUPING DATA </w:t>
-      </w:r>
-    </w:p>
-    <w:p>
-      <w:pPr>
-        <w:pStyle w:val="BodyText"/>
-      </w:pPr>
-      <w:r>
-        <w:t xml:space="preserve">Merging </w:t>
-      </w:r>
-      <w:proofErr w:type="spellStart"/>
-      <w:r>
-        <w:t>FactInternetSales</w:t>
-      </w:r>
-      <w:proofErr w:type="spellEnd"/>
-      <w:r>
-        <w:t>[</w:t>
-      </w:r>
-      <w:proofErr w:type="spellStart"/>
-      <w:r>
-        <w:t>SalesTerritoryKey</w:t>
-      </w:r>
-      <w:proofErr w:type="spellEnd"/>
-      <w:r>
-        <w:t xml:space="preserve">] = </w:t>
-      </w:r>
-      <w:proofErr w:type="spellStart"/>
-      <w:r>
-        <w:t>DimSalesTerritory</w:t>
-      </w:r>
-      <w:proofErr w:type="spellEnd"/>
-      <w:r>
-        <w:t>[</w:t>
-      </w:r>
-      <w:proofErr w:type="spellStart"/>
-      <w:r>
-        <w:t>SalesTerritoryKey</w:t>
-      </w:r>
-      <w:proofErr w:type="spellEnd"/>
-      <w:r>
-        <w:t>]</w:t>
-      </w:r>
-      <w:r>
-        <w:t xml:space="preserve"> to expand </w:t>
-      </w:r>
-      <w:proofErr w:type="spellStart"/>
-      <w:r>
-        <w:t>SalesTerritoryCountry</w:t>
-      </w:r>
-      <w:proofErr w:type="spellEnd"/>
-    </w:p>
-    <w:p>
-      <w:r>
+      <w:r>
+        <w:rPr>
+          <w:rStyle w:val="eop"/>
+          <w:rFonts w:ascii="Arial" w:hAnsi="Arial" w:cs="Arial"/>
+        </w:rPr>
+        <w:t> </w:t>
+      </w:r>
+    </w:p>
+    <w:p/>
+    <w:p>
+      <w:r>
+        <w:rPr>
+          <w:noProof/>
+        </w:rPr>
         <w:lastRenderedPageBreak/>
         <w:drawing>
-          <wp:inline distT="0" distB="0" distL="0" distR="0" wp14:anchorId="440B765C" wp14:editId="06C88BD4">
-            <wp:extent cx="4400776" cy="4007056"/>
+          <wp:inline distT="0" distB="0" distL="0" distR="0" wp14:anchorId="65344841" wp14:editId="7454B067">
+            <wp:extent cx="5943600" cy="4675505"/>
             <wp:effectExtent l="0" t="0" r="0" b="0"/>
-            <wp:docPr id="16" name="Picture 16"/>
+            <wp:docPr id="11" name="Picture 11"/>
             <wp:cNvGraphicFramePr>
               <a:graphicFrameLocks xmlns:a="http://schemas.openxmlformats.org/drawingml/2006/main" noChangeAspect="1"/>
             </wp:cNvGraphicFramePr>
@@ -1170,7 +1160,7 @@
                   <pic:spPr>
                     <a:xfrm>
                       <a:off x="0" y="0"/>
-                      <a:ext cx="4400776" cy="4007056"/>
+                      <a:ext cx="5943600" cy="4675505"/>
                     </a:xfrm>
                     <a:prstGeom prst="rect">
                       <a:avLst/>
@@ -1184,8 +1174,105 @@
       </w:r>
     </w:p>
     <w:p>
-      <w:r>
-        <w:t xml:space="preserve">Merge </w:t>
+      <w:pPr>
+        <w:pStyle w:val="paragraph"/>
+        <w:numPr>
+          <w:ilvl w:val="0"/>
+          <w:numId w:val="4"/>
+        </w:numPr>
+        <w:spacing w:before="0" w:beforeAutospacing="0" w:after="0" w:afterAutospacing="0"/>
+        <w:ind w:left="1080" w:firstLine="0"/>
+        <w:textAlignment w:val="baseline"/>
+        <w:rPr>
+          <w:rStyle w:val="eop"/>
+          <w:rFonts w:ascii="Arial" w:hAnsi="Arial" w:cs="Arial"/>
+          <w:sz w:val="20"/>
+          <w:szCs w:val="20"/>
+        </w:rPr>
+      </w:pPr>
+      <w:r>
+        <w:rPr>
+          <w:rStyle w:val="normaltextrun"/>
+          <w:rFonts w:ascii="Arial" w:hAnsi="Arial" w:cs="Arial"/>
+          <w:sz w:val="20"/>
+          <w:szCs w:val="20"/>
+        </w:rPr>
+        <w:t>Join </w:t>
+      </w:r>
+      <w:proofErr w:type="spellStart"/>
+      <w:r>
+        <w:rPr>
+          <w:rStyle w:val="normaltextrun"/>
+          <w:rFonts w:ascii="Arial" w:hAnsi="Arial" w:cs="Arial"/>
+          <w:sz w:val="20"/>
+          <w:szCs w:val="20"/>
+        </w:rPr>
+        <w:t>DimProductCategory</w:t>
+      </w:r>
+      <w:proofErr w:type="spellEnd"/>
+      <w:r>
+        <w:rPr>
+          <w:rStyle w:val="normaltextrun"/>
+          <w:rFonts w:ascii="Arial" w:hAnsi="Arial" w:cs="Arial"/>
+          <w:sz w:val="20"/>
+          <w:szCs w:val="20"/>
+        </w:rPr>
+        <w:t>[</w:t>
+      </w:r>
+      <w:proofErr w:type="spellStart"/>
+      <w:r>
+        <w:rPr>
+          <w:rStyle w:val="normaltextrun"/>
+          <w:rFonts w:ascii="Arial" w:hAnsi="Arial" w:cs="Arial"/>
+          <w:sz w:val="20"/>
+          <w:szCs w:val="20"/>
+        </w:rPr>
+        <w:t>EnglishProductCategory</w:t>
+      </w:r>
+      <w:proofErr w:type="spellEnd"/>
+      <w:r>
+        <w:rPr>
+          <w:rStyle w:val="normaltextrun"/>
+          <w:rFonts w:ascii="Arial" w:hAnsi="Arial" w:cs="Arial"/>
+          <w:sz w:val="20"/>
+          <w:szCs w:val="20"/>
+        </w:rPr>
+        <w:t>] column in the same way. </w:t>
+      </w:r>
+      <w:r>
+        <w:rPr>
+          <w:rStyle w:val="normaltextrun"/>
+          <w:rFonts w:ascii="Arial" w:hAnsi="Arial" w:cs="Arial"/>
+          <w:b/>
+          <w:bCs/>
+          <w:sz w:val="20"/>
+          <w:szCs w:val="20"/>
+        </w:rPr>
+        <w:t>(Hint: To complete this task you need to join 3 tables).</w:t>
+      </w:r>
+      <w:r>
+        <w:rPr>
+          <w:rStyle w:val="eop"/>
+          <w:rFonts w:ascii="Arial" w:hAnsi="Arial" w:cs="Arial"/>
+        </w:rPr>
+        <w:t> </w:t>
+      </w:r>
+    </w:p>
+    <w:p>
+      <w:pPr>
+        <w:pStyle w:val="Heading2"/>
+        <w:ind w:left="720"/>
+      </w:pPr>
+      <w:r>
+        <w:t>GROUPING DATA </w:t>
+      </w:r>
+    </w:p>
+    <w:p>
+      <w:pPr>
+        <w:pStyle w:val="BodyText"/>
+      </w:pPr>
+      <w:r>
+        <w:t xml:space="preserve">Merging </w:t>
       </w:r>
       <w:proofErr w:type="spellStart"/>
       <w:r>
@@ -1197,7 +1284,7 @@
       </w:r>
       <w:proofErr w:type="spellStart"/>
       <w:r>
-        <w:t>ProductKey</w:t>
+        <w:t>SalesTerritoryKey</w:t>
       </w:r>
       <w:proofErr w:type="spellEnd"/>
       <w:r>
@@ -1205,7 +1292,7 @@
       </w:r>
       <w:proofErr w:type="spellStart"/>
       <w:r>
-        <w:t>DimProduct</w:t>
+        <w:t>DimSalesTerritory</w:t>
       </w:r>
       <w:proofErr w:type="spellEnd"/>
       <w:r>
@@ -1213,32 +1300,29 @@
       </w:r>
       <w:proofErr w:type="spellStart"/>
       <w:r>
-        <w:t>ProductKey</w:t>
-      </w:r>
-      <w:proofErr w:type="spellEnd"/>
-      <w:r>
-        <w:t>]</w:t>
-      </w:r>
-      <w:r>
-        <w:t xml:space="preserve"> on </w:t>
-      </w:r>
-      <w:proofErr w:type="spellStart"/>
-      <w:r>
-        <w:t>DimProduct</w:t>
-      </w:r>
-      <w:proofErr w:type="spellEnd"/>
-      <w:r>
-        <w:t xml:space="preserve"> with left outer join </w:t>
-      </w:r>
-    </w:p>
-    <w:p>
-      <w:r>
+        <w:t>SalesTerritoryKey</w:t>
+      </w:r>
+      <w:proofErr w:type="spellEnd"/>
+      <w:r>
+        <w:t xml:space="preserve">] to expand </w:t>
+      </w:r>
+      <w:proofErr w:type="spellStart"/>
+      <w:r>
+        <w:t>SalesTerritoryCountry</w:t>
+      </w:r>
+      <w:proofErr w:type="spellEnd"/>
+    </w:p>
+    <w:p>
+      <w:r>
+        <w:rPr>
+          <w:noProof/>
+        </w:rPr>
         <w:lastRenderedPageBreak/>
         <w:drawing>
-          <wp:inline distT="0" distB="0" distL="0" distR="0" wp14:anchorId="615D715A" wp14:editId="58D282DA">
-            <wp:extent cx="4400776" cy="3988005"/>
+          <wp:inline distT="0" distB="0" distL="0" distR="0" wp14:anchorId="440B765C" wp14:editId="06C88BD4">
+            <wp:extent cx="4400776" cy="4007056"/>
             <wp:effectExtent l="0" t="0" r="0" b="0"/>
-            <wp:docPr id="18" name="Picture 18"/>
+            <wp:docPr id="16" name="Picture 16"/>
             <wp:cNvGraphicFramePr>
               <a:graphicFrameLocks xmlns:a="http://schemas.openxmlformats.org/drawingml/2006/main" noChangeAspect="1"/>
             </wp:cNvGraphicFramePr>
@@ -1258,7 +1342,7 @@
                   <pic:spPr>
                     <a:xfrm>
                       <a:off x="0" y="0"/>
-                      <a:ext cx="4400776" cy="3988005"/>
+                      <a:ext cx="4400776" cy="4007056"/>
                     </a:xfrm>
                     <a:prstGeom prst="rect">
                       <a:avLst/>
@@ -1273,11 +1357,60 @@
     </w:p>
     <w:p>
       <w:r>
+        <w:t xml:space="preserve">Merge </w:t>
+      </w:r>
+      <w:proofErr w:type="spellStart"/>
+      <w:r>
+        <w:t>FactInternetSales</w:t>
+      </w:r>
+      <w:proofErr w:type="spellEnd"/>
+      <w:r>
+        <w:t>[</w:t>
+      </w:r>
+      <w:proofErr w:type="spellStart"/>
+      <w:r>
+        <w:t>ProductKey</w:t>
+      </w:r>
+      <w:proofErr w:type="spellEnd"/>
+      <w:r>
+        <w:t xml:space="preserve">] = </w:t>
+      </w:r>
+      <w:proofErr w:type="spellStart"/>
+      <w:r>
+        <w:t>DimProduct</w:t>
+      </w:r>
+      <w:proofErr w:type="spellEnd"/>
+      <w:r>
+        <w:t>[</w:t>
+      </w:r>
+      <w:proofErr w:type="spellStart"/>
+      <w:r>
+        <w:t>ProductKey</w:t>
+      </w:r>
+      <w:proofErr w:type="spellEnd"/>
+      <w:r>
+        <w:t xml:space="preserve">] on </w:t>
+      </w:r>
+      <w:proofErr w:type="spellStart"/>
+      <w:r>
+        <w:t>DimProduct</w:t>
+      </w:r>
+      <w:proofErr w:type="spellEnd"/>
+      <w:r>
+        <w:t xml:space="preserve"> with left outer join </w:t>
+      </w:r>
+    </w:p>
+    <w:p>
+      <w:r>
+        <w:rPr>
+          <w:noProof/>
+        </w:rPr>
+        <w:lastRenderedPageBreak/>
         <w:drawing>
-          <wp:inline distT="0" distB="0" distL="0" distR="0" wp14:anchorId="09987D99" wp14:editId="55B2CB33">
-            <wp:extent cx="5943600" cy="2800985"/>
+          <wp:inline distT="0" distB="0" distL="0" distR="0" wp14:anchorId="615D715A" wp14:editId="58D282DA">
+            <wp:extent cx="4400776" cy="3988005"/>
             <wp:effectExtent l="0" t="0" r="0" b="0"/>
-            <wp:docPr id="19" name="Picture 19"/>
+            <wp:docPr id="18" name="Picture 18"/>
             <wp:cNvGraphicFramePr>
               <a:graphicFrameLocks xmlns:a="http://schemas.openxmlformats.org/drawingml/2006/main" noChangeAspect="1"/>
             </wp:cNvGraphicFramePr>
@@ -1297,7 +1430,7 @@
                   <pic:spPr>
                     <a:xfrm>
                       <a:off x="0" y="0"/>
-                      <a:ext cx="5943600" cy="2800985"/>
+                      <a:ext cx="4400776" cy="3988005"/>
                     </a:xfrm>
                     <a:prstGeom prst="rect">
                       <a:avLst/>
@@ -1312,12 +1445,14 @@
     </w:p>
     <w:p>
       <w:r>
-        <w:lastRenderedPageBreak/>
+        <w:rPr>
+          <w:noProof/>
+        </w:rPr>
         <w:drawing>
-          <wp:inline distT="0" distB="0" distL="0" distR="0" wp14:anchorId="2B8B180B" wp14:editId="1226222F">
-            <wp:extent cx="4407126" cy="3245017"/>
+          <wp:inline distT="0" distB="0" distL="0" distR="0" wp14:anchorId="09987D99" wp14:editId="55B2CB33">
+            <wp:extent cx="5943600" cy="2800985"/>
             <wp:effectExtent l="0" t="0" r="0" b="0"/>
-            <wp:docPr id="20" name="Picture 20"/>
+            <wp:docPr id="19" name="Picture 19"/>
             <wp:cNvGraphicFramePr>
               <a:graphicFrameLocks xmlns:a="http://schemas.openxmlformats.org/drawingml/2006/main" noChangeAspect="1"/>
             </wp:cNvGraphicFramePr>
@@ -1337,7 +1472,7 @@
                   <pic:spPr>
                     <a:xfrm>
                       <a:off x="0" y="0"/>
-                      <a:ext cx="4407126" cy="3245017"/>
+                      <a:ext cx="5943600" cy="2800985"/>
                     </a:xfrm>
                     <a:prstGeom prst="rect">
                       <a:avLst/>
@@ -1352,11 +1487,15 @@
     </w:p>
     <w:p>
       <w:r>
+        <w:rPr>
+          <w:noProof/>
+        </w:rPr>
+        <w:lastRenderedPageBreak/>
         <w:drawing>
-          <wp:inline distT="0" distB="0" distL="0" distR="0" wp14:anchorId="09EA6713" wp14:editId="49BE108D">
-            <wp:extent cx="5943600" cy="2673350"/>
+          <wp:inline distT="0" distB="0" distL="0" distR="0" wp14:anchorId="2B8B180B" wp14:editId="1226222F">
+            <wp:extent cx="4407126" cy="3245017"/>
             <wp:effectExtent l="0" t="0" r="0" b="0"/>
-            <wp:docPr id="21" name="Picture 21"/>
+            <wp:docPr id="20" name="Picture 20"/>
             <wp:cNvGraphicFramePr>
               <a:graphicFrameLocks xmlns:a="http://schemas.openxmlformats.org/drawingml/2006/main" noChangeAspect="1"/>
             </wp:cNvGraphicFramePr>
@@ -1376,7 +1515,7 @@
                   <pic:spPr>
                     <a:xfrm>
                       <a:off x="0" y="0"/>
-                      <a:ext cx="5943600" cy="2673350"/>
+                      <a:ext cx="4407126" cy="3245017"/>
                     </a:xfrm>
                     <a:prstGeom prst="rect">
                       <a:avLst/>
@@ -1391,18 +1530,14 @@
     </w:p>
     <w:p>
       <w:r>
-        <w:lastRenderedPageBreak/>
-        <w:t>Sort Ascending</w:t>
-      </w:r>
-      <w:r>
-        <w:br/>
-      </w:r>
-      <w:r>
+        <w:rPr>
+          <w:noProof/>
+        </w:rPr>
         <w:drawing>
-          <wp:inline distT="0" distB="0" distL="0" distR="0" wp14:anchorId="383FE40A" wp14:editId="203C16C9">
-            <wp:extent cx="5943600" cy="4001770"/>
+          <wp:inline distT="0" distB="0" distL="0" distR="0" wp14:anchorId="09EA6713" wp14:editId="49BE108D">
+            <wp:extent cx="5943600" cy="2673350"/>
             <wp:effectExtent l="0" t="0" r="0" b="0"/>
-            <wp:docPr id="22" name="Picture 22"/>
+            <wp:docPr id="21" name="Picture 21"/>
             <wp:cNvGraphicFramePr>
               <a:graphicFrameLocks xmlns:a="http://schemas.openxmlformats.org/drawingml/2006/main" noChangeAspect="1"/>
             </wp:cNvGraphicFramePr>
@@ -1422,7 +1557,7 @@
                   <pic:spPr>
                     <a:xfrm>
                       <a:off x="0" y="0"/>
-                      <a:ext cx="5943600" cy="4001770"/>
+                      <a:ext cx="5943600" cy="2673350"/>
                     </a:xfrm>
                     <a:prstGeom prst="rect">
                       <a:avLst/>
@@ -1436,48 +1571,22 @@
       </w:r>
     </w:p>
     <w:p>
-      <w:pPr>
-        <w:pStyle w:val="Heading2"/>
-        <w:ind w:left="720"/>
-      </w:pPr>
-      <w:r>
-        <w:t>TABLE JOINING </w:t>
-      </w:r>
-    </w:p>
-    <w:p>
-      <w:proofErr w:type="spellStart"/>
-      <w:r>
-        <w:t>DimProduct</w:t>
-      </w:r>
-      <w:proofErr w:type="spellEnd"/>
-      <w:r>
-        <w:t xml:space="preserve"> + </w:t>
-      </w:r>
-      <w:proofErr w:type="spellStart"/>
-      <w:r>
-        <w:t>DimProductSubcategory</w:t>
-      </w:r>
-      <w:proofErr w:type="spellEnd"/>
-      <w:r>
-        <w:t xml:space="preserve"> connect by </w:t>
-      </w:r>
-      <w:proofErr w:type="spellStart"/>
-      <w:r>
-        <w:t>ProductSubcategoryKey</w:t>
-      </w:r>
-      <w:proofErr w:type="spellEnd"/>
-      <w:r>
-        <w:t xml:space="preserve"> outer left join</w:t>
-      </w:r>
-    </w:p>
-    <w:p>
       <w:r>
         <w:lastRenderedPageBreak/>
+        <w:t>Sort Ascending</w:t>
+      </w:r>
+      <w:r>
+        <w:br/>
+      </w:r>
+      <w:r>
+        <w:rPr>
+          <w:noProof/>
+        </w:rPr>
         <w:drawing>
-          <wp:inline distT="0" distB="0" distL="0" distR="0" wp14:anchorId="0A1E3128" wp14:editId="43508560">
-            <wp:extent cx="4369025" cy="4007056"/>
+          <wp:inline distT="0" distB="0" distL="0" distR="0" wp14:anchorId="383FE40A" wp14:editId="203C16C9">
+            <wp:extent cx="5943600" cy="4001770"/>
             <wp:effectExtent l="0" t="0" r="0" b="0"/>
-            <wp:docPr id="12" name="Picture 12"/>
+            <wp:docPr id="22" name="Picture 22"/>
             <wp:cNvGraphicFramePr>
               <a:graphicFrameLocks xmlns:a="http://schemas.openxmlformats.org/drawingml/2006/main" noChangeAspect="1"/>
             </wp:cNvGraphicFramePr>
@@ -1497,7 +1606,7 @@
                   <pic:spPr>
                     <a:xfrm>
                       <a:off x="0" y="0"/>
-                      <a:ext cx="4369025" cy="4007056"/>
+                      <a:ext cx="5943600" cy="4001770"/>
                     </a:xfrm>
                     <a:prstGeom prst="rect">
                       <a:avLst/>
@@ -1511,12 +1620,51 @@
       </w:r>
     </w:p>
     <w:p>
-      <w:r>
+      <w:pPr>
+        <w:pStyle w:val="Heading2"/>
+        <w:ind w:left="720"/>
+      </w:pPr>
+      <w:r>
+        <w:t>TABLE JOINING </w:t>
+      </w:r>
+    </w:p>
+    <w:p>
+      <w:proofErr w:type="spellStart"/>
+      <w:r>
+        <w:t>DimProduct</w:t>
+      </w:r>
+      <w:proofErr w:type="spellEnd"/>
+      <w:r>
+        <w:t xml:space="preserve"> + </w:t>
+      </w:r>
+      <w:proofErr w:type="spellStart"/>
+      <w:r>
+        <w:t>DimProductSubcategory</w:t>
+      </w:r>
+      <w:proofErr w:type="spellEnd"/>
+      <w:r>
+        <w:t xml:space="preserve"> connect by </w:t>
+      </w:r>
+      <w:proofErr w:type="spellStart"/>
+      <w:r>
+        <w:t>ProductSubcategoryKey</w:t>
+      </w:r>
+      <w:proofErr w:type="spellEnd"/>
+      <w:r>
+        <w:t xml:space="preserve"> outer left join</w:t>
+      </w:r>
+    </w:p>
+    <w:p>
+      <w:r>
+        <w:rPr>
+          <w:noProof/>
+        </w:rPr>
+        <w:lastRenderedPageBreak/>
         <w:drawing>
-          <wp:inline distT="0" distB="0" distL="0" distR="0" wp14:anchorId="03199669" wp14:editId="07ABE827">
-            <wp:extent cx="5943600" cy="2494915"/>
-            <wp:effectExtent l="0" t="0" r="0" b="635"/>
-            <wp:docPr id="13" name="Picture 13"/>
+          <wp:inline distT="0" distB="0" distL="0" distR="0" wp14:anchorId="0A1E3128" wp14:editId="43508560">
+            <wp:extent cx="4369025" cy="4007056"/>
+            <wp:effectExtent l="0" t="0" r="0" b="0"/>
+            <wp:docPr id="12" name="Picture 12"/>
             <wp:cNvGraphicFramePr>
               <a:graphicFrameLocks xmlns:a="http://schemas.openxmlformats.org/drawingml/2006/main" noChangeAspect="1"/>
             </wp:cNvGraphicFramePr>
@@ -1536,7 +1684,7 @@
                   <pic:spPr>
                     <a:xfrm>
                       <a:off x="0" y="0"/>
-                      <a:ext cx="5943600" cy="2494915"/>
+                      <a:ext cx="4369025" cy="4007056"/>
                     </a:xfrm>
                     <a:prstGeom prst="rect">
                       <a:avLst/>
@@ -1551,51 +1699,14 @@
     </w:p>
     <w:p>
       <w:r>
-        <w:t xml:space="preserve">New column </w:t>
-      </w:r>
-      <w:proofErr w:type="spellStart"/>
-      <w:r>
-        <w:t>ProductCategoryKey</w:t>
-      </w:r>
-      <w:proofErr w:type="spellEnd"/>
-      <w:r>
-        <w:t xml:space="preserve"> after the join.</w:t>
-      </w:r>
-    </w:p>
-    <w:p>
-      <w:r>
-        <w:t xml:space="preserve">Result of the join of table </w:t>
-      </w:r>
-      <w:proofErr w:type="spellStart"/>
-      <w:r>
-        <w:t>DimProduct</w:t>
-      </w:r>
-      <w:proofErr w:type="spellEnd"/>
-      <w:r>
-        <w:t xml:space="preserve"> – left outer join with </w:t>
-      </w:r>
-      <w:proofErr w:type="spellStart"/>
-      <w:r>
-        <w:t>DimProductCategory</w:t>
-      </w:r>
-      <w:proofErr w:type="spellEnd"/>
-      <w:r>
-        <w:t xml:space="preserve"> by </w:t>
-      </w:r>
-      <w:proofErr w:type="spellStart"/>
-      <w:r>
-        <w:t>ProductCategoryKey</w:t>
-      </w:r>
-      <w:proofErr w:type="spellEnd"/>
-    </w:p>
-    <w:p>
-      <w:r>
-        <w:lastRenderedPageBreak/>
+        <w:rPr>
+          <w:noProof/>
+        </w:rPr>
         <w:drawing>
-          <wp:inline distT="0" distB="0" distL="0" distR="0" wp14:anchorId="68F5E7E0" wp14:editId="3CCD66B0">
-            <wp:extent cx="4419827" cy="4007056"/>
-            <wp:effectExtent l="0" t="0" r="0" b="0"/>
-            <wp:docPr id="14" name="Picture 14"/>
+          <wp:inline distT="0" distB="0" distL="0" distR="0" wp14:anchorId="03199669" wp14:editId="07ABE827">
+            <wp:extent cx="5943600" cy="2494915"/>
+            <wp:effectExtent l="0" t="0" r="0" b="635"/>
+            <wp:docPr id="13" name="Picture 13"/>
             <wp:cNvGraphicFramePr>
               <a:graphicFrameLocks xmlns:a="http://schemas.openxmlformats.org/drawingml/2006/main" noChangeAspect="1"/>
             </wp:cNvGraphicFramePr>
@@ -1615,7 +1726,7 @@
                   <pic:spPr>
                     <a:xfrm>
                       <a:off x="0" y="0"/>
-                      <a:ext cx="4419827" cy="4007056"/>
+                      <a:ext cx="5943600" cy="2494915"/>
                     </a:xfrm>
                     <a:prstGeom prst="rect">
                       <a:avLst/>
@@ -1630,11 +1741,54 @@
     </w:p>
     <w:p>
       <w:r>
+        <w:t xml:space="preserve">New column </w:t>
+      </w:r>
+      <w:proofErr w:type="spellStart"/>
+      <w:r>
+        <w:t>ProductCategoryKey</w:t>
+      </w:r>
+      <w:proofErr w:type="spellEnd"/>
+      <w:r>
+        <w:t xml:space="preserve"> after the join.</w:t>
+      </w:r>
+    </w:p>
+    <w:p>
+      <w:r>
+        <w:t xml:space="preserve">Result of the join of table </w:t>
+      </w:r>
+      <w:proofErr w:type="spellStart"/>
+      <w:r>
+        <w:t>DimProduct</w:t>
+      </w:r>
+      <w:proofErr w:type="spellEnd"/>
+      <w:r>
+        <w:t xml:space="preserve"> – left outer join with </w:t>
+      </w:r>
+      <w:proofErr w:type="spellStart"/>
+      <w:r>
+        <w:t>DimProductCategory</w:t>
+      </w:r>
+      <w:proofErr w:type="spellEnd"/>
+      <w:r>
+        <w:t xml:space="preserve"> by </w:t>
+      </w:r>
+      <w:proofErr w:type="spellStart"/>
+      <w:r>
+        <w:t>ProductCategoryKey</w:t>
+      </w:r>
+      <w:proofErr w:type="spellEnd"/>
+    </w:p>
+    <w:p>
+      <w:r>
+        <w:rPr>
+          <w:noProof/>
+        </w:rPr>
+        <w:lastRenderedPageBreak/>
         <w:drawing>
-          <wp:inline distT="0" distB="0" distL="0" distR="0" wp14:anchorId="2EE95531" wp14:editId="4875F7D1">
-            <wp:extent cx="5943600" cy="2742565"/>
-            <wp:effectExtent l="0" t="0" r="0" b="635"/>
-            <wp:docPr id="15" name="Picture 15"/>
+          <wp:inline distT="0" distB="0" distL="0" distR="0" wp14:anchorId="68F5E7E0" wp14:editId="3CCD66B0">
+            <wp:extent cx="4419827" cy="4007056"/>
+            <wp:effectExtent l="0" t="0" r="0" b="0"/>
+            <wp:docPr id="14" name="Picture 14"/>
             <wp:cNvGraphicFramePr>
               <a:graphicFrameLocks xmlns:a="http://schemas.openxmlformats.org/drawingml/2006/main" noChangeAspect="1"/>
             </wp:cNvGraphicFramePr>
@@ -1654,7 +1808,7 @@
                   <pic:spPr>
                     <a:xfrm>
                       <a:off x="0" y="0"/>
-                      <a:ext cx="5943600" cy="2742565"/>
+                      <a:ext cx="4419827" cy="4007056"/>
                     </a:xfrm>
                     <a:prstGeom prst="rect">
                       <a:avLst/>
@@ -1669,32 +1823,14 @@
     </w:p>
     <w:p>
       <w:r>
-        <w:t xml:space="preserve">Result of the second join the field </w:t>
-      </w:r>
-      <w:proofErr w:type="spellStart"/>
-      <w:r>
-        <w:t>EnglishProductCategoryName</w:t>
-      </w:r>
-      <w:proofErr w:type="spellEnd"/>
-    </w:p>
-    <w:p/>
-    <w:p>
-      <w:pPr>
-        <w:pStyle w:val="Heading2"/>
-        <w:ind w:left="720"/>
-      </w:pPr>
-      <w:r>
-        <w:lastRenderedPageBreak/>
-        <w:t>Load Data</w:t>
-      </w:r>
-    </w:p>
-    <w:p>
-      <w:r>
+        <w:rPr>
+          <w:noProof/>
+        </w:rPr>
         <w:drawing>
-          <wp:inline distT="0" distB="0" distL="0" distR="0" wp14:anchorId="29A837AB" wp14:editId="5980021E">
-            <wp:extent cx="5943600" cy="2941320"/>
-            <wp:effectExtent l="0" t="0" r="0" b="0"/>
-            <wp:docPr id="23" name="Picture 23"/>
+          <wp:inline distT="0" distB="0" distL="0" distR="0" wp14:anchorId="2EE95531" wp14:editId="4875F7D1">
+            <wp:extent cx="5943600" cy="2742565"/>
+            <wp:effectExtent l="0" t="0" r="0" b="635"/>
+            <wp:docPr id="15" name="Picture 15"/>
             <wp:cNvGraphicFramePr>
               <a:graphicFrameLocks xmlns:a="http://schemas.openxmlformats.org/drawingml/2006/main" noChangeAspect="1"/>
             </wp:cNvGraphicFramePr>
@@ -1714,7 +1850,7 @@
                   <pic:spPr>
                     <a:xfrm>
                       <a:off x="0" y="0"/>
-                      <a:ext cx="5943600" cy="2941320"/>
+                      <a:ext cx="5943600" cy="2742565"/>
                     </a:xfrm>
                     <a:prstGeom prst="rect">
                       <a:avLst/>
@@ -1728,63 +1864,36 @@
       </w:r>
     </w:p>
     <w:p>
+      <w:r>
+        <w:t xml:space="preserve">Result of the second join the field </w:t>
+      </w:r>
+      <w:proofErr w:type="spellStart"/>
+      <w:r>
+        <w:t>EnglishProductCategoryName</w:t>
+      </w:r>
+      <w:proofErr w:type="spellEnd"/>
+    </w:p>
+    <w:p/>
+    <w:p>
       <w:pPr>
         <w:pStyle w:val="Heading2"/>
         <w:ind w:left="720"/>
       </w:pPr>
       <w:r>
-        <w:t>IMPORT VS DIRECT QUERY </w:t>
-      </w:r>
-    </w:p>
-    <w:p>
-      <w:r>
-        <w:t>In Import mode, Power BI loads and stores a copy of the source data in its internal data model. The changes in the source are not immediately reflected in the report; the dataset must be refreshed to retrieve updated data.</w:t>
-      </w:r>
-    </w:p>
-    <w:p>
-      <w:r>
-        <w:t xml:space="preserve">In </w:t>
-      </w:r>
-      <w:proofErr w:type="spellStart"/>
-      <w:r>
-        <w:t>DirectQuery</w:t>
-      </w:r>
-      <w:proofErr w:type="spellEnd"/>
-      <w:r>
-        <w:t xml:space="preserve"> mode, the data remains in the source database and is not fully imported into the Power BI model. When a user interacts with a report, Power BI sends queries to the source system to retrieve the required data.</w:t>
-      </w:r>
-    </w:p>
-    <w:p>
-      <w:pPr>
-        <w:pStyle w:val="Heading2"/>
-        <w:ind w:left="720"/>
-      </w:pPr>
-      <w:r>
-        <w:rPr>
-          <w:rStyle w:val="normaltextrun"/>
-          <w:rFonts w:cs="Arial"/>
-          <w:caps w:val="0"/>
-        </w:rPr>
-        <w:t>WORKING WITH POWER BI MODEL</w:t>
-      </w:r>
-      <w:r>
-        <w:rPr>
-          <w:rStyle w:val="eop"/>
-          <w:rFonts w:cs="Arial"/>
-          <w:caps w:val="0"/>
-        </w:rPr>
-        <w:t> </w:t>
-      </w:r>
-    </w:p>
-    <w:p/>
-    <w:p>
-      <w:r>
         <w:lastRenderedPageBreak/>
+        <w:t>Load Data</w:t>
+      </w:r>
+    </w:p>
+    <w:p>
+      <w:r>
+        <w:rPr>
+          <w:noProof/>
+        </w:rPr>
         <w:drawing>
-          <wp:inline distT="0" distB="0" distL="0" distR="0" wp14:anchorId="7612EBFF" wp14:editId="678CFA6E">
-            <wp:extent cx="5943600" cy="5155565"/>
-            <wp:effectExtent l="0" t="0" r="0" b="6985"/>
-            <wp:docPr id="25" name="Picture 25"/>
+          <wp:inline distT="0" distB="0" distL="0" distR="0" wp14:anchorId="77376889" wp14:editId="189DACDF">
+            <wp:extent cx="5943600" cy="3473450"/>
+            <wp:effectExtent l="0" t="0" r="0" b="0"/>
+            <wp:docPr id="17" name="Picture 17"/>
             <wp:cNvGraphicFramePr>
               <a:graphicFrameLocks xmlns:a="http://schemas.openxmlformats.org/drawingml/2006/main" noChangeAspect="1"/>
             </wp:cNvGraphicFramePr>
@@ -1804,6 +1913,179 @@
                   <pic:spPr>
                     <a:xfrm>
                       <a:off x="0" y="0"/>
+                      <a:ext cx="5943600" cy="3473450"/>
+                    </a:xfrm>
+                    <a:prstGeom prst="rect">
+                      <a:avLst/>
+                    </a:prstGeom>
+                  </pic:spPr>
+                </pic:pic>
+              </a:graphicData>
+            </a:graphic>
+          </wp:inline>
+        </w:drawing>
+      </w:r>
+    </w:p>
+    <w:p>
+      <w:pPr>
+        <w:pStyle w:val="Heading2"/>
+        <w:ind w:left="720"/>
+      </w:pPr>
+      <w:r>
+        <w:t>IMPORT VS DIRECT QUERY </w:t>
+      </w:r>
+    </w:p>
+    <w:p>
+      <w:r>
+        <w:t xml:space="preserve">The size of the Power BI file created using Import mode was </w:t>
+      </w:r>
+      <w:r>
+        <w:t>3,113</w:t>
+      </w:r>
+      <w:r>
+        <w:t xml:space="preserve"> </w:t>
+      </w:r>
+      <w:r>
+        <w:t>K</w:t>
+      </w:r>
+      <w:r>
+        <w:t xml:space="preserve">B, whereas the size of the file created using </w:t>
+      </w:r>
+      <w:proofErr w:type="spellStart"/>
+      <w:r>
+        <w:t>DirectQuery</w:t>
+      </w:r>
+      <w:proofErr w:type="spellEnd"/>
+      <w:r>
+        <w:t xml:space="preserve"> was </w:t>
+      </w:r>
+      <w:r>
+        <w:t>60 K</w:t>
+      </w:r>
+      <w:r>
+        <w:t xml:space="preserve">B. </w:t>
+      </w:r>
+      <w:r>
+        <w:drawing>
+          <wp:inline distT="0" distB="0" distL="0" distR="0" wp14:anchorId="4726018A" wp14:editId="3C5A03BA">
+            <wp:extent cx="5943600" cy="1285240"/>
+            <wp:effectExtent l="0" t="0" r="0" b="0"/>
+            <wp:docPr id="2" name="Picture 2"/>
+            <wp:cNvGraphicFramePr>
+              <a:graphicFrameLocks xmlns:a="http://schemas.openxmlformats.org/drawingml/2006/main" noChangeAspect="1"/>
+            </wp:cNvGraphicFramePr>
+            <a:graphic xmlns:a="http://schemas.openxmlformats.org/drawingml/2006/main">
+              <a:graphicData uri="http://schemas.openxmlformats.org/drawingml/2006/picture">
+                <pic:pic xmlns:pic="http://schemas.openxmlformats.org/drawingml/2006/picture">
+                  <pic:nvPicPr>
+                    <pic:cNvPr id="1" name=""/>
+                    <pic:cNvPicPr/>
+                  </pic:nvPicPr>
+                  <pic:blipFill>
+                    <a:blip r:embed="rId28"/>
+                    <a:stretch>
+                      <a:fillRect/>
+                    </a:stretch>
+                  </pic:blipFill>
+                  <pic:spPr>
+                    <a:xfrm>
+                      <a:off x="0" y="0"/>
+                      <a:ext cx="5943600" cy="1285240"/>
+                    </a:xfrm>
+                    <a:prstGeom prst="rect">
+                      <a:avLst/>
+                    </a:prstGeom>
+                  </pic:spPr>
+                </pic:pic>
+              </a:graphicData>
+            </a:graphic>
+          </wp:inline>
+        </w:drawing>
+      </w:r>
+    </w:p>
+    <w:p>
+      <w:r>
+        <w:t xml:space="preserve">This difference was expected from the practical implementation because, in Import mode, the data used by the report was loaded into the Power BI data model and stored as part of the PBIX file. In </w:t>
+      </w:r>
+      <w:proofErr w:type="spellStart"/>
+      <w:r>
+        <w:t>DirectQuery</w:t>
+      </w:r>
+      <w:proofErr w:type="spellEnd"/>
+      <w:r>
+        <w:t xml:space="preserve"> mode, the report remained connected to SQL Server and the source data was not imported into the Power BI model in the same way.</w:t>
+      </w:r>
+    </w:p>
+    <w:p>
+      <w:r>
+        <w:t>In the Import report, changes made in the SQL Server database were not automatically available in the imported model until the data was refreshed.</w:t>
+      </w:r>
+    </w:p>
+    <w:p>
+      <w:r>
+        <w:t>Conclusion</w:t>
+      </w:r>
+    </w:p>
+    <w:p/>
+    <w:p>
+      <w:r>
+        <w:lastRenderedPageBreak/>
+        <w:t>Based on my practical comparison, Import mode was more convenient for this particular report because the dataset was small enough to be imported and report interactions were responsive without continuously querying SQL Server. The main disadvantage observed was the larger PBIX file size and the need to refresh the model when the source data changed.</w:t>
+      </w:r>
+    </w:p>
+    <w:p/>
+    <w:p>
+      <w:pPr>
+        <w:pStyle w:val="Heading2"/>
+        <w:ind w:left="720"/>
+      </w:pPr>
+      <w:r>
+        <w:rPr>
+          <w:rStyle w:val="normaltextrun"/>
+          <w:rFonts w:cs="Arial"/>
+          <w:caps w:val="0"/>
+        </w:rPr>
+        <w:t>WORKING WITH POWER BI MODEL</w:t>
+      </w:r>
+      <w:r>
+        <w:rPr>
+          <w:rStyle w:val="eop"/>
+          <w:rFonts w:cs="Arial"/>
+          <w:caps w:val="0"/>
+        </w:rPr>
+        <w:t> </w:t>
+      </w:r>
+    </w:p>
+    <w:p/>
+    <w:p>
+      <w:r>
+        <w:rPr>
+          <w:noProof/>
+        </w:rPr>
+        <w:drawing>
+          <wp:inline distT="0" distB="0" distL="0" distR="0" wp14:anchorId="7612EBFF" wp14:editId="678CFA6E">
+            <wp:extent cx="5943600" cy="5155565"/>
+            <wp:effectExtent l="0" t="0" r="0" b="6985"/>
+            <wp:docPr id="25" name="Picture 25"/>
+            <wp:cNvGraphicFramePr>
+              <a:graphicFrameLocks xmlns:a="http://schemas.openxmlformats.org/drawingml/2006/main" noChangeAspect="1"/>
+            </wp:cNvGraphicFramePr>
+            <a:graphic xmlns:a="http://schemas.openxmlformats.org/drawingml/2006/main">
+              <a:graphicData uri="http://schemas.openxmlformats.org/drawingml/2006/picture">
+                <pic:pic xmlns:pic="http://schemas.openxmlformats.org/drawingml/2006/picture">
+                  <pic:nvPicPr>
+                    <pic:cNvPr id="1" name=""/>
+                    <pic:cNvPicPr/>
+                  </pic:nvPicPr>
+                  <pic:blipFill>
+                    <a:blip r:embed="rId29"/>
+                    <a:stretch>
+                      <a:fillRect/>
+                    </a:stretch>
+                  </pic:blipFill>
+                  <pic:spPr>
+                    <a:xfrm>
+                      <a:off x="0" y="0"/>
                       <a:ext cx="5943600" cy="5155565"/>
                     </a:xfrm>
                     <a:prstGeom prst="rect">
@@ -1846,6 +2128,9 @@
     </w:p>
     <w:p>
       <w:r>
+        <w:rPr>
+          <w:noProof/>
+        </w:rPr>
         <w:drawing>
           <wp:inline distT="0" distB="0" distL="0" distR="0" wp14:anchorId="3263CEBF" wp14:editId="313D4501">
             <wp:extent cx="5943600" cy="695960"/>
@@ -1862,7 +2147,7 @@
                     <pic:cNvPicPr/>
                   </pic:nvPicPr>
                   <pic:blipFill>
-                    <a:blip r:embed="rId28"/>
+                    <a:blip r:embed="rId30"/>
                     <a:stretch>
                       <a:fillRect/>
                     </a:stretch>
@@ -2419,7 +2704,6 @@
   </w:abstractNum>
   <w:num w:numId="1">
     <w:abstractNumId w:val="0"/>
-    <w:lvlOverride w:ilvl="0"/>
   </w:num>
   <w:num w:numId="2">
     <w:abstractNumId w:val="2"/>

</xml_diff>